<commit_message>
Sync methodology paper to current project state (status + settled choices)
Update the methodology document (literature/si_graphene_li_diffusion_methodology_paper.docx)
to match the project through Phase 7, scope limited to status + settled methodology
(no results numbers inserted):

- Current status: Phase 1/2 in progress -> Phases 1-7 complete.
- Production temperature: firmed up to 1200 K NVT run as a continuous
  300->600->900->1200 K staged ramp.
- Timestep: firmed up to the validated 0.25 fs for all ReaxFF MD (two cells).
- Added a Version 4 revision note: records the sync, that Model A/B use 4 Li each,
  and that diffusion coefficients/fitting windows stay project-discovered and are
  apparent/comparative-only on the current short 4-Li runs.

Literature-justification columns and references left untouched. Verified the .docx
reopens cleanly (zip OK, python-docx round-trip) after editing.
</commit_message>
<xml_diff>
--- a/literature/si_graphene_li_diffusion_methodology_paper.docx
+++ b/literature/si_graphene_li_diffusion_methodology_paper.docx
@@ -289,7 +289,7 @@
               <w:rPr>
                 <w:sz w:val="16"/>
               </w:rPr>
-              <w:t>Phase 1 complete; Phase 2 structure generation/visualization in progress</w:t>
+              <w:t>Phases 1-7 complete: toolchain and structures validated; Li-Si-C ReaxFF/QEq verified; Model A (pristine) and Model B (single-vacancy) built and equilibrated; production NVT MD run as a continuous 300-&gt;1200 K staged ramp; Li MSD/diffusion analysis completed (diffusion values comparative-only under this MD protocol).</w:t>
             </w:r>
           </w:p>
         </w:tc>
@@ -364,6 +364,9 @@
                 <w:sz w:val="16"/>
               </w:rPr>
               <w:t>Revision purpose: This refined version separates literature-backed input values from values that must be discovered by the project. Values taken from papers are listed with specific references. Values not yet tested remain marked as pending. Version 3 update: the uploaded PDFs were cross-checked; Gao et al. journal metadata was corrected, verified 2025 Si et al. values were inserted, and the ReaxFF timestep note was updated to include 0.5 fs MD and 0.1 fs tracer-diffusion precedent.</w:t>
+            </w:r>
+            <w:r>
+              <w:t xml:space="preserve">  Version 4 update (2026-06-17): synced Current status to Phases 1-7 complete and firmed up the settled production choices (0.25 fs timestep; 1200 K NVT run as a 300-1200 K staged ramp). Model A and Model B use 4 Li each. Diffusion coefficients and fitting windows remain project-discovered and are apparent/comparative-only on the current short 4-Li runs.</w:t>
             </w:r>
           </w:p>
         </w:tc>
@@ -1506,7 +1509,7 @@
               <w:rPr>
                 <w:sz w:val="16"/>
               </w:rPr>
-              <w:t>Start ReaxFF testing at 0.5 fs; test 0.25, 0.5, and 1.0 fs if needed; do not copy the 3 fs AIMD timestep directly into ReaxFF</w:t>
+              <w:t>Settled: 0.25 fs validated and used for all ReaxFF MD (Phases 4-6); do not copy the 3 fs AIMD timestep directly into ReaxFF.</w:t>
             </w:r>
           </w:p>
         </w:tc>
@@ -6149,7 +6152,7 @@
               <w:rPr>
                 <w:sz w:val="16"/>
               </w:rPr>
-              <w:t>Main accelerated test: choose 800 K or 1200 K; optional lower-temperature check later</w:t>
+              <w:t>Settled: production NVT at 1200 K (Si et al. comparator), run as a continuous 300 -&gt; 600 -&gt; 900 -&gt; 1200 K staged ramp (~10 ps/stage); full temperature sweep available.</w:t>
             </w:r>
           </w:p>
         </w:tc>
@@ -6213,7 +6216,7 @@
               <w:rPr>
                 <w:sz w:val="16"/>
               </w:rPr>
-              <w:t>Start ReaxFF tests at 0.5 fs; test 0.25, 0.5, and 1.0 fs if needed; reduce toward 0.1 fs for tracer-diffusion-quality checks if necessary</w:t>
+              <w:t>Settled: 0.25 fs validated and used for all ReaxFF production MD (stable QEq, no dangerous builds across Phases 4-6).</w:t>
             </w:r>
           </w:p>
         </w:tc>

</xml_diff>